<commit_message>
Add package citations and session-info.txt
</commit_message>
<xml_diff>
--- a/manuscript.docx
+++ b/manuscript.docx
@@ -50,7 +50,7 @@
         <w:t xml:space="preserve">Meta-scientific research has revealed that researchers often fall short in implementing best research practices when designing studies, reporting findings, citing the literature, or sharing data and code. Researchers face time constraints that limit the extent to which they can master all aspects of the research process, and cognitive constraints that limit which practices they remember to implement in their work. By capturing expert knowledge within an automated tool, we aim to elevate the quality of scientific research and disseminate best research practices more widely. We illustrate how best practices can be automatically detected by analyzing articles published in Psychological Science in the last decade. Researchers can use the tool before submitting or when reviewing scientific articles. Our modular tool can be easily extended by the research community to automatically check for best research practices, educate researchers, and improve the quality of scientific reporting.</w:t>
       </w:r>
     </w:p>
-    <w:bookmarkStart w:id="21" w:name="introduction"/>
+    <w:bookmarkStart w:id="10" w:name="introduction"/>
     <w:p>
       <w:pPr>
         <w:pStyle w:val="Heading1"/>
@@ -100,7 +100,16 @@
         <w:t xml:space="preserve"> </w:t>
       </w:r>
       <w:r>
-        <w:t xml:space="preserve">(Akker et al. 2024)</w:t>
+        <w:t xml:space="preserve">(</w:t>
+      </w:r>
+      <w:r>
+        <w:t xml:space="preserve">Akker et al.</w:t>
+      </w:r>
+      <w:r>
+        <w:t xml:space="preserve"> </w:t>
+      </w:r>
+      <w:r>
+        <w:t xml:space="preserve">2024)</w:t>
       </w:r>
       <w:r>
         <w:t xml:space="preserve">, invalid power analyses</w:t>
@@ -201,7 +210,7 @@
         <w:t xml:space="preserve">Automated checks can quite accurately identify the presence or absence of information that should be reported (e.g., is the magnitude of the effect size reported in an a priori power analysis?), but a bigger challenge is to evaluate whether the provided information is valid (e.g., is there a good justification for the effect size entered in an a priori power analysis?). Metacheck focuses on the first task, and leaves the evaluation to the user. We will illustrate the potential of automated checks to improve best research practices in four areas, namely 1) experimental design, 2) open science practices, 3) statistical inferences, and 4) reporting guidelines. Finally, we will demonstrate the usefulness of a tool that can efficiently process text in scientific articles to perform menial tasks (e.g., check whether hyperlinks work), extract information from scientific articles for meta-scientific research, and incorporate existing automated checks (e.g., statcheck and check for citations to retracted articles) in a single modular workflow that can be expanded by the scientific community. We perform these checks on 1937 articles published in Psychological Science from 2014 to 2026. This set of articles contains studies from all subfields in psychology.</w:t>
       </w:r>
     </w:p>
-    <w:bookmarkStart w:id="20" w:name="use-cases"/>
+    <w:bookmarkStart w:id="9" w:name="use-cases"/>
     <w:p>
       <w:pPr>
         <w:pStyle w:val="Heading2"/>
@@ -291,9 +300,9 @@
         <w:t xml:space="preserve">The second use case for Metacheck is as a meta-scientific tool to examine a large number of research articles. For example, a science funder might be interested in how many manuscripts by researchers whom they fund share data and code in line with its policy. A meta-researcher might be interested in how many articles report effect sizes in a specific literature, and assess whether reporting practices have improved. A scientific journal might want to evaluate how a change in editorial practices has impacted the diversity in populations that are examined in the studies they publish. Metacheck modules can easily be run on large numbers of articles, facilitating text searches and the automatic extraction and classification of information. In this use case, the usability of an automated tool requires low error rates if users are to rely on e the output of the tool. Here, Type 2 errors are problematic and difficult to identify, because identifying them requires users to manually screen all articles for instances that were missed by the modules, and if manual screening were feasible, there would be little need for an automated tool. Type 1 errors might be easier to identify but still require users to manually check all instances flagged by a module. Therefore, low error rates are important for the usability of Metacheck as a meta-scientific tool. Validation procedures that quantify error rates are essential to safeguard the accuracy of results, allow users to evaluate whether modules are accurate enough for their purposes, and to report the corresponding error rates when presenting results. It is possible that a module has low enough error rates for the individual use case, while still being too high for meta-scientific use cases.</w:t>
       </w:r>
     </w:p>
-    <w:bookmarkEnd w:id="20"/>
-    <w:bookmarkEnd w:id="21"/>
-    <w:bookmarkStart w:id="53" w:name="examples"/>
+    <w:bookmarkEnd w:id="9"/>
+    <w:bookmarkEnd w:id="10"/>
+    <w:bookmarkStart w:id="42" w:name="examples"/>
     <w:p>
       <w:pPr>
         <w:pStyle w:val="Heading1"/>
@@ -302,7 +311,153 @@
         <w:t xml:space="preserve">Examples</w:t>
       </w:r>
     </w:p>
-    <w:bookmarkStart w:id="52" w:name="modules"/>
+    <w:p>
+      <w:pPr>
+        <w:pStyle w:val="FirstParagraph"/>
+      </w:pPr>
+      <w:r>
+        <w:t xml:space="preserve">In the following section, we demonstrate how to use selected Metacheck modules from both a researcher’s perspective and a meta-scientific perspective. All examples were produced using R</w:t>
+      </w:r>
+      <w:r>
+        <w:t xml:space="preserve"> </w:t>
+      </w:r>
+      <w:r>
+        <w:t xml:space="preserve">(Posit team 2026)</w:t>
+      </w:r>
+      <w:r>
+        <w:t xml:space="preserve"> </w:t>
+      </w:r>
+      <w:r>
+        <w:t xml:space="preserve">and the following R packages:</w:t>
+      </w:r>
+      <w:r>
+        <w:t xml:space="preserve"> </w:t>
+      </w:r>
+      <w:r>
+        <w:rPr>
+          <w:rStyle w:val="VerbatimChar"/>
+        </w:rPr>
+        <w:t xml:space="preserve">dplyr</w:t>
+      </w:r>
+      <w:r>
+        <w:t xml:space="preserve"> </w:t>
+      </w:r>
+      <w:r>
+        <w:t xml:space="preserve">(Wickham, François, et al. 2026)</w:t>
+      </w:r>
+      <w:r>
+        <w:t xml:space="preserve">,</w:t>
+      </w:r>
+      <w:r>
+        <w:t xml:space="preserve"> </w:t>
+      </w:r>
+      <w:r>
+        <w:rPr>
+          <w:rStyle w:val="VerbatimChar"/>
+        </w:rPr>
+        <w:t xml:space="preserve">ggplot2</w:t>
+      </w:r>
+      <w:r>
+        <w:t xml:space="preserve"> </w:t>
+      </w:r>
+      <w:r>
+        <w:t xml:space="preserve">(</w:t>
+      </w:r>
+      <w:r>
+        <w:t xml:space="preserve">Wickham, Chang, et al.</w:t>
+      </w:r>
+      <w:r>
+        <w:t xml:space="preserve"> </w:t>
+      </w:r>
+      <w:r>
+        <w:t xml:space="preserve">2026)</w:t>
+      </w:r>
+      <w:r>
+        <w:t xml:space="preserve">,</w:t>
+      </w:r>
+      <w:r>
+        <w:t xml:space="preserve"> </w:t>
+      </w:r>
+      <w:r>
+        <w:rPr>
+          <w:rStyle w:val="VerbatimChar"/>
+        </w:rPr>
+        <w:t xml:space="preserve">kableExtra</w:t>
+      </w:r>
+      <w:r>
+        <w:t xml:space="preserve"> </w:t>
+      </w:r>
+      <w:r>
+        <w:t xml:space="preserve">(Zhu 2024)</w:t>
+      </w:r>
+      <w:r>
+        <w:t xml:space="preserve">,</w:t>
+      </w:r>
+      <w:r>
+        <w:t xml:space="preserve"> </w:t>
+      </w:r>
+      <w:r>
+        <w:rPr>
+          <w:rStyle w:val="VerbatimChar"/>
+        </w:rPr>
+        <w:t xml:space="preserve">knitr</w:t>
+      </w:r>
+      <w:r>
+        <w:t xml:space="preserve"> </w:t>
+      </w:r>
+      <w:r>
+        <w:t xml:space="preserve">(Xie 2025)</w:t>
+      </w:r>
+      <w:r>
+        <w:t xml:space="preserve">,</w:t>
+      </w:r>
+      <w:r>
+        <w:t xml:space="preserve"> </w:t>
+      </w:r>
+      <w:r>
+        <w:rPr>
+          <w:rStyle w:val="VerbatimChar"/>
+        </w:rPr>
+        <w:t xml:space="preserve">metacheck</w:t>
+      </w:r>
+      <w:r>
+        <w:t xml:space="preserve"> </w:t>
+      </w:r>
+      <w:r>
+        <w:t xml:space="preserve">(DeBruine et al. 2026)</w:t>
+      </w:r>
+      <w:r>
+        <w:t xml:space="preserve">, and</w:t>
+      </w:r>
+      <w:r>
+        <w:t xml:space="preserve"> </w:t>
+      </w:r>
+      <w:r>
+        <w:rPr>
+          <w:rStyle w:val="VerbatimChar"/>
+        </w:rPr>
+        <w:t xml:space="preserve">stringr</w:t>
+      </w:r>
+      <w:r>
+        <w:t xml:space="preserve"> </w:t>
+      </w:r>
+      <w:r>
+        <w:t xml:space="preserve">(Wickham 2025)</w:t>
+      </w:r>
+      <w:r>
+        <w:t xml:space="preserve">. This article was written using Quarto</w:t>
+      </w:r>
+      <w:r>
+        <w:t xml:space="preserve"> </w:t>
+      </w:r>
+      <w:r>
+        <w:t xml:space="preserve">(Allaire and Dervieux 2025)</w:t>
+      </w:r>
+      <w:r>
+        <w:t xml:space="preserve">.</w:t>
+      </w:r>
+    </w:p>
+    <w:bookmarkStart w:id="41" w:name="modules"/>
     <w:p>
       <w:pPr>
         <w:pStyle w:val="Heading2"/>
@@ -311,7 +466,7 @@
         <w:t xml:space="preserve">Modules</w:t>
       </w:r>
     </w:p>
-    <w:bookmarkStart w:id="36" w:name="checking-reported-p-values"/>
+    <w:bookmarkStart w:id="25" w:name="checking-reported-p-values"/>
     <w:p>
       <w:pPr>
         <w:pStyle w:val="Heading3"/>
@@ -472,7 +627,7 @@
         <w:t xml:space="preserve"> </w:t>
       </w:r>
       <w:r>
-        <w:t xml:space="preserve">(Simonsohn, Nelson, and Simmons 2014)</w:t>
+        <w:t xml:space="preserve">(Simonsohn et al. 2014)</w:t>
       </w:r>
       <w:r>
         <w:t xml:space="preserve"> </w:t>
@@ -564,13 +719,13 @@
       <w:tr>
         <w:tc>
           <w:tcPr/>
-          <w:bookmarkStart w:id="22" w:name="tbl-res_imprecise"/>
+          <w:bookmarkStart w:id="11" w:name="tbl-res_imprecise"/>
           <w:p>
             <w:pPr>
               <w:jc w:val="center"/>
             </w:pPr>
             <w:pPr>
-              <w:jc w:val="start"/>
+              <w:jc w:val="left"/>
               <w:spacing w:before="200"/>
               <w:pStyle w:val="ImageCaption"/>
             </w:pPr>
@@ -664,7 +819,7 @@
               </w:tc>
             </w:tr>
           </w:tbl>
-          <w:bookmarkEnd w:id="22"/>
+          <w:bookmarkEnd w:id="11"/>
           <w:p/>
         </w:tc>
       </w:tr>
@@ -884,7 +1039,7 @@
       <w:tr>
         <w:tc>
           <w:tcPr/>
-          <w:bookmarkStart w:id="26" w:name="fig-imprecise-pvalues"/>
+          <w:bookmarkStart w:id="15" w:name="fig-imprecise-pvalues"/>
           <w:p>
             <w:pPr>
               <w:pStyle w:val="Compact"/>
@@ -895,18 +1050,18 @@
                 <wp:inline>
                   <wp:extent cx="5334000" cy="4267200"/>
                   <wp:effectExtent b="0" l="0" r="0" t="0"/>
-                  <wp:docPr descr="" title="" id="24" name="Picture"/>
+                  <wp:docPr descr="" title="" id="13" name="Picture"/>
                   <a:graphic>
                     <a:graphicData uri="http://schemas.openxmlformats.org/drawingml/2006/picture">
                       <pic:pic>
                         <pic:nvPicPr>
-                          <pic:cNvPr descr="manuscript_files/figure-docx/fig-imprecise-pvalues-1.png" id="25" name="Picture"/>
+                          <pic:cNvPr descr="manuscript_files/figure-docx/fig-imprecise-pvalues-1.png" id="14" name="Picture"/>
                           <pic:cNvPicPr>
                             <a:picLocks noChangeArrowheads="1" noChangeAspect="1"/>
                           </pic:cNvPicPr>
                         </pic:nvPicPr>
                         <pic:blipFill>
-                          <a:blip r:embed="rId23"/>
+                          <a:blip r:embed="rId12"/>
                           <a:stretch>
                             <a:fillRect/>
                           </a:stretch>
@@ -938,7 +1093,7 @@
               <w:jc w:val="center"/>
             </w:pPr>
             <w:pPr>
-              <w:jc w:val="start"/>
+              <w:jc w:val="left"/>
               <w:spacing w:before="200"/>
               <w:pStyle w:val="ImageCaption"/>
             </w:pPr>
@@ -959,7 +1114,7 @@
               <w:t xml:space="preserve">-values, by statistical significance.</w:t>
             </w:r>
           </w:p>
-          <w:bookmarkEnd w:id="26"/>
+          <w:bookmarkEnd w:id="15"/>
         </w:tc>
       </w:tr>
     </w:tbl>
@@ -976,7 +1131,7 @@
       <w:tr>
         <w:tc>
           <w:tcPr/>
-          <w:bookmarkStart w:id="30" w:name="fig-atleastone"/>
+          <w:bookmarkStart w:id="19" w:name="fig-atleastone"/>
           <w:p>
             <w:pPr>
               <w:pStyle w:val="Compact"/>
@@ -987,18 +1142,18 @@
                 <wp:inline>
                   <wp:extent cx="5334000" cy="4267200"/>
                   <wp:effectExtent b="0" l="0" r="0" t="0"/>
-                  <wp:docPr descr="" title="" id="28" name="Picture"/>
+                  <wp:docPr descr="" title="" id="17" name="Picture"/>
                   <a:graphic>
                     <a:graphicData uri="http://schemas.openxmlformats.org/drawingml/2006/picture">
                       <pic:pic>
                         <pic:nvPicPr>
-                          <pic:cNvPr descr="manuscript_files/figure-docx/fig-atleastone-1.png" id="29" name="Picture"/>
+                          <pic:cNvPr descr="manuscript_files/figure-docx/fig-atleastone-1.png" id="18" name="Picture"/>
                           <pic:cNvPicPr>
                             <a:picLocks noChangeArrowheads="1" noChangeAspect="1"/>
                           </pic:cNvPicPr>
                         </pic:nvPicPr>
                         <pic:blipFill>
-                          <a:blip r:embed="rId27"/>
+                          <a:blip r:embed="rId16"/>
                           <a:stretch>
                             <a:fillRect/>
                           </a:stretch>
@@ -1030,7 +1185,7 @@
               <w:jc w:val="center"/>
             </w:pPr>
             <w:pPr>
-              <w:jc w:val="start"/>
+              <w:jc w:val="left"/>
               <w:spacing w:before="200"/>
               <w:pStyle w:val="ImageCaption"/>
             </w:pPr>
@@ -1051,7 +1206,7 @@
               <w:t xml:space="preserve">-value.</w:t>
             </w:r>
           </w:p>
-          <w:bookmarkEnd w:id="30"/>
+          <w:bookmarkEnd w:id="19"/>
         </w:tc>
       </w:tr>
     </w:tbl>
@@ -1135,7 +1290,7 @@
         <w:t xml:space="preserve"> </w:t>
       </w:r>
       <w:r>
-        <w:t xml:space="preserve">(Hosmer Jr, Lemeshow, and Sturdivant 2013)</w:t>
+        <w:t xml:space="preserve">(Hosmer Jr et al. 2013)</w:t>
       </w:r>
       <w:r>
         <w:t xml:space="preserve">. However, we have no evidence this is the source of the convention. The correct approach for concluding that an effect is not meaningful (i.e., equivalent to zero) is to perform an equivalence test against a smallest effect size of interest</w:t>
@@ -1144,7 +1299,7 @@
         <w:t xml:space="preserve"> </w:t>
       </w:r>
       <w:r>
-        <w:t xml:space="preserve">(Lakens, Scheel, and Isager 2018)</w:t>
+        <w:t xml:space="preserve">(Lakens et al. 2018)</w:t>
       </w:r>
       <w:r>
         <w:t xml:space="preserve">.</w:t>
@@ -1163,7 +1318,7 @@
       <w:tr>
         <w:tc>
           <w:tcPr/>
-          <w:bookmarkStart w:id="34" w:name="fig-hist"/>
+          <w:bookmarkStart w:id="23" w:name="fig-hist"/>
           <w:p>
             <w:pPr>
               <w:pStyle w:val="Compact"/>
@@ -1174,18 +1329,18 @@
                 <wp:inline>
                   <wp:extent cx="5334000" cy="4267200"/>
                   <wp:effectExtent b="0" l="0" r="0" t="0"/>
-                  <wp:docPr descr="" title="" id="32" name="Picture"/>
+                  <wp:docPr descr="" title="" id="21" name="Picture"/>
                   <a:graphic>
                     <a:graphicData uri="http://schemas.openxmlformats.org/drawingml/2006/picture">
                       <pic:pic>
                         <pic:nvPicPr>
-                          <pic:cNvPr descr="manuscript_files/figure-docx/fig-hist-1.png" id="33" name="Picture"/>
+                          <pic:cNvPr descr="manuscript_files/figure-docx/fig-hist-1.png" id="22" name="Picture"/>
                           <pic:cNvPicPr>
                             <a:picLocks noChangeArrowheads="1" noChangeAspect="1"/>
                           </pic:cNvPicPr>
                         </pic:nvPicPr>
                         <pic:blipFill>
-                          <a:blip r:embed="rId31"/>
+                          <a:blip r:embed="rId20"/>
                           <a:stretch>
                             <a:fillRect/>
                           </a:stretch>
@@ -1217,7 +1372,7 @@
               <w:jc w:val="center"/>
             </w:pPr>
             <w:pPr>
-              <w:jc w:val="start"/>
+              <w:jc w:val="left"/>
               <w:spacing w:before="200"/>
               <w:pStyle w:val="ImageCaption"/>
             </w:pPr>
@@ -1238,7 +1393,7 @@
               <w:t xml:space="preserve">-values.</w:t>
             </w:r>
           </w:p>
-          <w:bookmarkEnd w:id="34"/>
+          <w:bookmarkEnd w:id="23"/>
         </w:tc>
       </w:tr>
     </w:tbl>
@@ -1409,13 +1564,13 @@
       <w:tr>
         <w:tc>
           <w:tcPr/>
-          <w:bookmarkStart w:id="35" w:name="tbl-non_sig"/>
+          <w:bookmarkStart w:id="24" w:name="tbl-non_sig"/>
           <w:p>
             <w:pPr>
               <w:jc w:val="center"/>
             </w:pPr>
             <w:pPr>
-              <w:jc w:val="start"/>
+              <w:jc w:val="left"/>
               <w:spacing w:before="200"/>
               <w:pStyle w:val="ImageCaption"/>
             </w:pPr>
@@ -1509,7 +1664,7 @@
               </w:tc>
             </w:tr>
           </w:tbl>
-          <w:bookmarkEnd w:id="35"/>
+          <w:bookmarkEnd w:id="24"/>
           <w:p/>
         </w:tc>
       </w:tr>
@@ -1621,8 +1776,8 @@
         <w:t xml:space="preserve">-values (93).</w:t>
       </w:r>
     </w:p>
-    <w:bookmarkEnd w:id="36"/>
-    <w:bookmarkStart w:id="42" w:name="checking-unreported-effect-sizes"/>
+    <w:bookmarkEnd w:id="25"/>
+    <w:bookmarkStart w:id="31" w:name="checking-unreported-effect-sizes"/>
     <w:p>
       <w:pPr>
         <w:pStyle w:val="Heading3"/>
@@ -1888,7 +2043,7 @@
       <w:tr>
         <w:tc>
           <w:tcPr/>
-          <w:bookmarkStart w:id="40" w:name="fig-es-trend"/>
+          <w:bookmarkStart w:id="29" w:name="fig-es-trend"/>
           <w:p>
             <w:pPr>
               <w:pStyle w:val="Compact"/>
@@ -1899,18 +2054,18 @@
                 <wp:inline>
                   <wp:extent cx="5334000" cy="4267200"/>
                   <wp:effectExtent b="0" l="0" r="0" t="0"/>
-                  <wp:docPr descr="" title="" id="38" name="Picture"/>
+                  <wp:docPr descr="" title="" id="27" name="Picture"/>
                   <a:graphic>
                     <a:graphicData uri="http://schemas.openxmlformats.org/drawingml/2006/picture">
                       <pic:pic>
                         <pic:nvPicPr>
-                          <pic:cNvPr descr="manuscript_files/figure-docx/fig-es-trend-1.png" id="39" name="Picture"/>
+                          <pic:cNvPr descr="manuscript_files/figure-docx/fig-es-trend-1.png" id="28" name="Picture"/>
                           <pic:cNvPicPr>
                             <a:picLocks noChangeArrowheads="1" noChangeAspect="1"/>
                           </pic:cNvPicPr>
                         </pic:nvPicPr>
                         <pic:blipFill>
-                          <a:blip r:embed="rId37"/>
+                          <a:blip r:embed="rId26"/>
                           <a:stretch>
                             <a:fillRect/>
                           </a:stretch>
@@ -1942,7 +2097,7 @@
               <w:jc w:val="center"/>
             </w:pPr>
             <w:pPr>
-              <w:jc w:val="start"/>
+              <w:jc w:val="left"/>
               <w:spacing w:before="200"/>
               <w:pStyle w:val="ImageCaption"/>
             </w:pPr>
@@ -1976,7 +2131,7 @@
               <w:t xml:space="preserve">-tests without effect sizes.</w:t>
             </w:r>
           </w:p>
-          <w:bookmarkEnd w:id="40"/>
+          <w:bookmarkEnd w:id="29"/>
         </w:tc>
       </w:tr>
     </w:tbl>
@@ -2219,13 +2374,13 @@
       <w:tr>
         <w:tc>
           <w:tcPr/>
-          <w:bookmarkStart w:id="41" w:name="tbl-es_d"/>
+          <w:bookmarkStart w:id="30" w:name="tbl-es_d"/>
           <w:p>
             <w:pPr>
               <w:jc w:val="center"/>
             </w:pPr>
             <w:pPr>
-              <w:jc w:val="start"/>
+              <w:jc w:val="left"/>
               <w:spacing w:before="200"/>
               <w:pStyle w:val="ImageCaption"/>
             </w:pPr>
@@ -2427,13 +2582,13 @@
               </w:tc>
             </w:tr>
           </w:tbl>
-          <w:bookmarkEnd w:id="41"/>
+          <w:bookmarkEnd w:id="30"/>
           <w:p/>
         </w:tc>
       </w:tr>
     </w:tbl>
-    <w:bookmarkEnd w:id="42"/>
-    <w:bookmarkStart w:id="47" w:name="checking-power-analyses"/>
+    <w:bookmarkEnd w:id="31"/>
+    <w:bookmarkStart w:id="36" w:name="checking-power-analyses"/>
     <w:p>
       <w:pPr>
         <w:pStyle w:val="Heading3"/>
@@ -2692,13 +2847,13 @@
       <w:tr>
         <w:tc>
           <w:tcPr/>
-          <w:bookmarkStart w:id="43" w:name="tbl-no_llm_power"/>
+          <w:bookmarkStart w:id="32" w:name="tbl-no_llm_power"/>
           <w:p>
             <w:pPr>
               <w:jc w:val="center"/>
             </w:pPr>
             <w:pPr>
-              <w:jc w:val="start"/>
+              <w:jc w:val="left"/>
               <w:spacing w:before="200"/>
               <w:pStyle w:val="ImageCaption"/>
             </w:pPr>
@@ -2792,7 +2947,7 @@
               </w:tc>
             </w:tr>
           </w:tbl>
-          <w:bookmarkEnd w:id="43"/>
+          <w:bookmarkEnd w:id="32"/>
           <w:p/>
         </w:tc>
       </w:tr>
@@ -2810,13 +2965,13 @@
       <w:tr>
         <w:tc>
           <w:tcPr/>
-          <w:bookmarkStart w:id="44" w:name="tbl-power_type"/>
+          <w:bookmarkStart w:id="33" w:name="tbl-power_type"/>
           <w:p>
             <w:pPr>
               <w:jc w:val="center"/>
             </w:pPr>
             <w:pPr>
-              <w:jc w:val="start"/>
+              <w:jc w:val="left"/>
               <w:spacing w:before="200"/>
               <w:pStyle w:val="ImageCaption"/>
             </w:pPr>
@@ -2978,7 +3133,7 @@
               </w:tc>
             </w:tr>
           </w:tbl>
-          <w:bookmarkEnd w:id="44"/>
+          <w:bookmarkEnd w:id="33"/>
           <w:p/>
         </w:tc>
       </w:tr>
@@ -3042,7 +3197,7 @@
       <w:r>
         <w:t xml:space="preserve"> </w:t>
       </w:r>
-      <w:hyperlink r:id="rId45">
+      <w:hyperlink r:id="rId34">
         <w:r>
           <w:rPr>
             <w:rStyle w:val="Hyperlink"/>
@@ -3059,7 +3214,7 @@
         <w:pStyle w:val="FirstParagraph"/>
       </w:pPr>
       <w:r>
-        <w:t xml:space="preserve">So far, we have classified power analyses using only a rule-based approach. However, a limitation of currently reported power analyses is the lack of standardization in how their components are described and reported. This lack of standardization makes it difficult, if not impossible, to reliably extract relevant information using a rule-based approach alone. This limitation can be partially addressed by using a LLM to classify and extract information from reported power analyses.</w:t>
+        <w:t xml:space="preserve">So far, we have classified power analyses using only a rule-based approach. However, a limitation of currently reported power analyses is the lack of standardization in how their components are described and reported. This lack of standardization makes it difficult, if not impossible, to reliably extract relevant information using a rule-based approach alone. This limitation can be partially addressed by using an LLM to classify and extract information from reported power analyses.</w:t>
       </w:r>
     </w:p>
     <w:p>
@@ -3067,7 +3222,7 @@
         <w:pStyle w:val="BodyText"/>
       </w:pPr>
       <w:r>
-        <w:t xml:space="preserve">Importantly, the LLM-based approach is opt-in. By default, the module operates without using a LLM. Users can enable this functionality by setting</w:t>
+        <w:t xml:space="preserve">Importantly, the LLM-based approach is opt-in. By default, the module operates without using an LLM. Users can enable this functionality by setting</w:t>
       </w:r>
       <w:r>
         <w:t xml:space="preserve"> </w:t>
@@ -3102,7 +3257,7 @@
         <w:t xml:space="preserve"> </w:t>
       </w:r>
       <w:r>
-        <w:t xml:space="preserve">module is that the LLM can be accessed either through an API or locally on the user’s computer. By default, Metacheck uses the Groq API to process the LLM component. However, users may prefer to ensure that data do not leave their computer, for example when working with sensitive or confidential materials. In such cases, the module can be configured to run models locally, such as Ollama.</w:t>
+        <w:t xml:space="preserve">module is that the LLM can be accessed either through an API or locally on the user’s computer. By default, Metacheck uses the Groq API to process the LLM component. However, users may prefer to ensure that data does not leave their computer, for example when working with sensitive or confidential materials. In such cases, the module can be configured to run models locally, such as Ollama.</w:t>
       </w:r>
     </w:p>
     <w:p>
@@ -3127,7 +3282,7 @@
         <w:t xml:space="preserve"> </w:t>
       </w:r>
       <w:r>
-        <w:t xml:space="preserve">reports the cases and proportion of components identified in a sample a sample of 1937. To generate these results, the</w:t>
+        <w:t xml:space="preserve">reports the cases and proportion of components identified in a sample of 1937. To generate these results, the</w:t>
       </w:r>
       <w:r>
         <w:t xml:space="preserve"> </w:t>
@@ -3158,13 +3313,13 @@
       <w:tr>
         <w:tc>
           <w:tcPr/>
-          <w:bookmarkStart w:id="46" w:name="tbl-power_llm"/>
+          <w:bookmarkStart w:id="35" w:name="tbl-power_llm"/>
           <w:p>
             <w:pPr>
               <w:jc w:val="center"/>
             </w:pPr>
             <w:pPr>
-              <w:jc w:val="start"/>
+              <w:jc w:val="left"/>
               <w:spacing w:before="200"/>
               <w:pStyle w:val="ImageCaption"/>
             </w:pPr>
@@ -3438,7 +3593,7 @@
               </w:tc>
             </w:tr>
           </w:tbl>
-          <w:bookmarkEnd w:id="46"/>
+          <w:bookmarkEnd w:id="35"/>
           <w:p/>
         </w:tc>
       </w:tr>
@@ -3476,7 +3631,7 @@
         <w:t xml:space="preserve">Psychological Science</w:t>
       </w:r>
       <w:r>
-        <w:t xml:space="preserve">, the module using the LLM-based approach currently identifies and extracts information from 663 articles containing 1295 sentences identified as reporting power analyses. Not all missing information is equally problematic. For example, a missing alpha level is less concerning because the conventional value of 5% is used in the vast majority of studies, although some researchers use more stringent thresholds (e.g., 0.01) or adjust alpha levels to account for multiple comparisons. By contrast, missing information about the statistical test is more concerning given the multiplicity of statistical tests used in psychology articles. Missing the expected effect size is also particularly problematic because this component is central to justifying the planned sample size.</w:t>
+        <w:t xml:space="preserve">, the module using the LLM-based approach currently identifies and extracts information from 663 articles containing 1295 sentences identified as reporting power analyses. Not all missing information is equally problematic. For example, a missing alpha level is less concerning because the conventional value of 5% is used in most studies, although some researchers use more stringent thresholds (e.g., 0.01) or adjust alpha levels to account for multiple comparisons. By contrast, missing information about the statistical test is more concerning given the multiplicity of statistical tests used in psychology articles. Missing the expected effect size is also particularly problematic because this component is central to justifying the planned sample size.</w:t>
       </w:r>
     </w:p>
     <w:p>
@@ -3484,7 +3639,7 @@
         <w:pStyle w:val="BodyText"/>
       </w:pPr>
       <w:r>
-        <w:t xml:space="preserve">Given the lack of standardization in how power analyses are reported and the complexity of human language, Type 1 and Type 2 errors should be expected. For an example, the sentence</w:t>
+        <w:t xml:space="preserve">Given the lack of standardization in how power analyses are reported, and the complexity of human language, Type 1 and Type 2 errors should be expected. For an example, the sentence</w:t>
       </w:r>
       <w:r>
         <w:t xml:space="preserve"> </w:t>
@@ -3645,11 +3800,11 @@
         <w:t xml:space="preserve"> </w:t>
       </w:r>
       <w:r>
-        <w:t xml:space="preserve">module was evaluated on 250 open-access articles published in Psychological Science, for which a ground-truth dataset was manually created. Accuracy was highest for identifying the alpha level (0.89), software used for the analysis (0.84), and achieved power (0.83). Accuracy was also relatively high for extracting the expected effect size (0.76) and sample size (0.73), and moderate for identifying the statistical test (0.70). The lowest accuracy was observed for the type of power analysis (0.52) and the metric used to express the expected effect size (0.59). These results indicate that the module performs better for components that are typically reported using standardized numerical values or commonly recognized software names, whereas components that depend more heavily on contextual interpretation or inconsistent reporting terminology are more challenging to extract accurately.</w:t>
-      </w:r>
-    </w:p>
-    <w:bookmarkEnd w:id="47"/>
-    <w:bookmarkStart w:id="49" w:name="checking-statements"/>
+        <w:t xml:space="preserve">module was evaluated on 250 open-access articles published in Psychological Science, for which a ground-truth dataset was manually created. Accuracy was highest for identifying the alpha level (0.89), software used for the analysis (0.84) and achieved power (0.83). Accuracy was also relatively high for extracting the expected effect size (0.76) and sample size (0.73), and moderate for identifying the statistical test (0.70). The lowest accuracy was observed for the type of power analysis (0.52) and the metric used to express the expected effect size (0.59). These results indicate that the module performs better for components that are typically reported using standardized numerical values or commonly recognized software names, whereas components that depend more heavily on contextual interpretation or inconsistent reporting terminology are more challenging to extract accurately.</w:t>
+      </w:r>
+    </w:p>
+    <w:bookmarkEnd w:id="36"/>
+    <w:bookmarkStart w:id="38" w:name="checking-statements"/>
     <w:p>
       <w:pPr>
         <w:pStyle w:val="Heading3"/>
@@ -3663,7 +3818,7 @@
         <w:pStyle w:val="FirstParagraph"/>
       </w:pPr>
       <w:r>
-        <w:t xml:space="preserve">So far, we have focused on modules that capture expertise about best research practices. However, an additional category are checks that do not require expertise but still benefit from automation. These checks can be time consuming and may be overlooked by researchers despite being relatively straightforward to perform. We will illustrate the usefulness of Metacheck for automating such routine tasks with the rule-based module</w:t>
+        <w:t xml:space="preserve">So far, we have focused on modules that capture expertise about best research practices. However, an additional category is checks that do not require expertise but still benefit from automation. These checks can be time consuming and may be overlooked by researchers despite being relatively straightforward to perform. We will illustrate the usefulness of Metacheck for automating such routine tasks with the rule-based module</w:t>
       </w:r>
       <w:r>
         <w:t xml:space="preserve"> </w:t>
@@ -3683,7 +3838,7 @@
         <w:pStyle w:val="BodyText"/>
       </w:pPr>
       <w:r>
-        <w:t xml:space="preserve">This module searches for statements indicating that data, code, materials, or a preregistration are openly available. It returns the sentences in which such statements are identified and classifies, for each type of open practice, whether a corresponding statement was detected.</w:t>
+        <w:t xml:space="preserve">This module searches for statements indicating that data, code, materials, or preregistration are openly available. It returns the sentences in which such statements are identified and classifies, for each type of open practice, whether a corresponding statement was detected.</w:t>
       </w:r>
     </w:p>
     <w:p>
@@ -3718,13 +3873,13 @@
       <w:tr>
         <w:tc>
           <w:tcPr/>
-          <w:bookmarkStart w:id="48" w:name="tbl-open_practices"/>
+          <w:bookmarkStart w:id="37" w:name="tbl-open_practices"/>
           <w:p>
             <w:pPr>
               <w:jc w:val="center"/>
             </w:pPr>
             <w:pPr>
-              <w:jc w:val="start"/>
+              <w:jc w:val="left"/>
               <w:spacing w:before="200"/>
               <w:pStyle w:val="ImageCaption"/>
             </w:pPr>
@@ -4018,7 +4173,7 @@
               </w:tc>
             </w:tr>
           </w:tbl>
-          <w:bookmarkEnd w:id="48"/>
+          <w:bookmarkEnd w:id="37"/>
           <w:p/>
         </w:tc>
       </w:tr>
@@ -4042,8 +4197,8 @@
         <w:t xml:space="preserve">&gt; Data for the present experiments are available on request from the corresponding author.”</w:t>
       </w:r>
     </w:p>
-    <w:bookmarkEnd w:id="49"/>
-    <w:bookmarkStart w:id="51" w:name="checking-references"/>
+    <w:bookmarkEnd w:id="38"/>
+    <w:bookmarkStart w:id="40" w:name="checking-references"/>
     <w:p>
       <w:pPr>
         <w:pStyle w:val="Heading3"/>
@@ -4063,16 +4218,19 @@
         <w:t xml:space="preserve"> </w:t>
       </w:r>
       <w:r>
-        <w:t xml:space="preserve">(Röseler et al. 2024)</w:t>
-      </w:r>
-      <w:r>
-        <w:t xml:space="preserve">; identifying incoherent references; and</w:t>
-      </w:r>
-      <w:r>
-        <w:t xml:space="preserve"> </w:t>
-      </w:r>
-      <w:r>
-        <w:t xml:space="preserve">identifying whether cited articles have comments on PubPeer. Such comments may be worth knowing about, as they can range from minor clarifications to serious concerns about the work.</w:t>
+        <w:t xml:space="preserve">(</w:t>
+      </w:r>
+      <w:r>
+        <w:t xml:space="preserve">Röseler et al.</w:t>
+      </w:r>
+      <w:r>
+        <w:t xml:space="preserve"> </w:t>
+      </w:r>
+      <w:r>
+        <w:t xml:space="preserve">2024)</w:t>
+      </w:r>
+      <w:r>
+        <w:t xml:space="preserve">; identifying incoherent references; and identifying whether cited articles have comments on PubPeer. Such comments may be worth knowing about, as they can range from minor clarifications to serious concerns about the work.</w:t>
       </w:r>
     </w:p>
     <w:p>
@@ -4153,13 +4311,13 @@
       <w:tr>
         <w:tc>
           <w:tcPr/>
-          <w:bookmarkStart w:id="50" w:name="tbl-ref_pubpeer"/>
+          <w:bookmarkStart w:id="39" w:name="tbl-ref_pubpeer"/>
           <w:p>
             <w:pPr>
               <w:jc w:val="center"/>
             </w:pPr>
             <w:pPr>
-              <w:jc w:val="start"/>
+              <w:jc w:val="left"/>
               <w:spacing w:before="200"/>
               <w:pStyle w:val="ImageCaption"/>
             </w:pPr>
@@ -4321,15 +4479,15 @@
               </w:tc>
             </w:tr>
           </w:tbl>
-          <w:bookmarkEnd w:id="50"/>
+          <w:bookmarkEnd w:id="39"/>
           <w:p/>
         </w:tc>
       </w:tr>
     </w:tbl>
-    <w:bookmarkEnd w:id="51"/>
-    <w:bookmarkEnd w:id="52"/>
-    <w:bookmarkEnd w:id="53"/>
-    <w:bookmarkStart w:id="55" w:name="creating-metacheck-modules"/>
+    <w:bookmarkEnd w:id="40"/>
+    <w:bookmarkEnd w:id="41"/>
+    <w:bookmarkEnd w:id="42"/>
+    <w:bookmarkStart w:id="44" w:name="creating-metacheck-modules"/>
     <w:p>
       <w:pPr>
         <w:pStyle w:val="Heading1"/>
@@ -4351,7 +4509,7 @@
         <w:pStyle w:val="BodyText"/>
       </w:pPr>
       <w:r>
-        <w:t xml:space="preserve">Anyone can develop a module and validate its performance. Modules can be developed and installed locally, or contributed to the Metacheck R package through a GitHub pull request. This flexibility enables journals to develop modules that verify compliance with their submission guidelines, methodological experts to automate checks for issues they frequently identify during peer review, and organizations to create modules that assess adherence to reporting guidelines that they publish.</w:t>
+        <w:t xml:space="preserve">Anyone can develop a module and validate its performance. Modules can be developed and installed locally or contributed to the Metacheck R package through a GitHub pull request. This flexibility enables journals to develop modules that verify compliance with their submission guidelines, methodological experts to automate checks for issues they frequently identify during peer review, and organizations to create modules that assess adherence to reporting guidelines that they publish.</w:t>
       </w:r>
     </w:p>
     <w:p>
@@ -4359,7 +4517,7 @@
         <w:pStyle w:val="BodyText"/>
       </w:pPr>
       <w:r>
-        <w:t xml:space="preserve">Metacheck can also serve as a hub for existing automated tools. Researchers often need to use multiple software packages, websites or online services to evaluate different aspects of a manuscript. Integrating these checks into a single tool simplifies this workflow and may also increase awareness of tools that researchers would otherwise not discover.</w:t>
+        <w:t xml:space="preserve">Metacheck can also serve as a hub for existing automated tools. Researchers often need to use multiple software packages, websites, or online services to evaluate different aspects of a manuscript. Integrating these checks into a single tool simplifies this workflow and may also increase awareness of tools that researchers would otherwise not discover.</w:t>
       </w:r>
     </w:p>
     <w:p>
@@ -4367,7 +4525,7 @@
         <w:pStyle w:val="BodyText"/>
       </w:pPr>
       <w:r>
-        <w:t xml:space="preserve">As a proof of concept, we developed a Metacheck module for Statcheck</w:t>
+        <w:t xml:space="preserve">As proof of concept, we developed a Metacheck module for Statcheck</w:t>
       </w:r>
       <w:r>
         <w:t xml:space="preserve"> </w:t>
@@ -4425,34 +4583,7 @@
         <w:t xml:space="preserve"> </w:t>
       </w:r>
       <w:r>
-        <w:t xml:space="preserve">tests, Statcheck achieved a true positive rate of 85.3%, increasing to 100% when one-tailed tests were explicitly identified using terms such as</w:t>
-      </w:r>
-      <w:r>
-        <w:t xml:space="preserve"> </w:t>
-      </w:r>
-      <w:r>
-        <w:t xml:space="preserve">“one-tailed”</w:t>
-      </w:r>
-      <w:r>
-        <w:t xml:space="preserve">,</w:t>
-      </w:r>
-      <w:r>
-        <w:t xml:space="preserve"> </w:t>
-      </w:r>
-      <w:r>
-        <w:t xml:space="preserve">“one-sided”</w:t>
-      </w:r>
-      <w:r>
-        <w:t xml:space="preserve">, or</w:t>
-      </w:r>
-      <w:r>
-        <w:t xml:space="preserve"> </w:t>
-      </w:r>
-      <w:r>
-        <w:t xml:space="preserve">“directional”</w:t>
-      </w:r>
-      <w:r>
-        <w:t xml:space="preserve">. In contrast, Statcheck has not been validated for correlations (</w:t>
+        <w:t xml:space="preserve">tests, Statcheck achieved a true positive rate of 85.3%, increasing to 100% when one-tailed tests were explicitly identified using terms such as “one-tailed”, “one-sided”, or “directional”. In contrast, Statcheck has not been validated for correlations (</w:t>
       </w:r>
       <w:r>
         <w:rPr>
@@ -4501,7 +4632,7 @@
       <w:r>
         <w:t xml:space="preserve"> </w:t>
       </w:r>
-      <w:hyperlink r:id="rId54">
+      <w:hyperlink r:id="rId43">
         <w:r>
           <w:rPr>
             <w:rStyle w:val="Hyperlink"/>
@@ -4519,11 +4650,11 @@
         <w:t xml:space="preserve">(Cummins et al. 2026)</w:t>
       </w:r>
       <w:r>
-        <w:t xml:space="preserve">. Metacheck also has a module that checks preregistrations but it takes a slightly different approach. Rather than relying on LLM-based comparison, it automatically retrieves the preregistration from AsPredicted automatically and extracts the preregistered sample size, taking advantage of the AsPredicted structured template. Metacheck then presents this information alongside the manuscript, allowing users to quickly compare the preregistered and the reported sample sizes.</w:t>
-      </w:r>
-    </w:p>
-    <w:bookmarkEnd w:id="55"/>
-    <w:bookmarkStart w:id="56" w:name="discussion"/>
+        <w:t xml:space="preserve">. Metacheck also has a module that checks preregistrations, but it takes a slightly different approach. Rather than relying on LLM-based comparison, it automatically retrieves the preregistration from AsPredicted automatically and extracts the preregistered sample size, taking advantage of the AsPredicted structured template. Metacheck then presents this information alongside the manuscript, allowing users to quickly compare the preregistered and the reported sample sizes.</w:t>
+      </w:r>
+    </w:p>
+    <w:bookmarkEnd w:id="44"/>
+    <w:bookmarkStart w:id="45" w:name="discussion"/>
     <w:p>
       <w:pPr>
         <w:pStyle w:val="Heading1"/>
@@ -4537,11 +4668,11 @@
         <w:pStyle w:val="FirstParagraph"/>
       </w:pPr>
       <w:r>
-        <w:t xml:space="preserve">To prevent the widespread misuse of an automated tool such as Metacheck, it is important to recognize its limitations. Although it may seem desirable for every module to achieve very high accuracy, a cost-benefit analysis suggests that, at this stage, it is more valuable to develop a broad range of modules that provide useful assistance despite moderate error rates than to devote the same effort to a small number of modules that achieve near-perfect accuracy and are primarily suitable for meta-scientific research. This trade-off reflects the inherent complexity of scientific writing. The flexibility of human language, combined with the lack of standardization in how information is reported in manuscripts, means that reducing a module’s error rate from 50% to 20% is often substantially easier than reducing it from 20% to 5%. Consequently, our current development strategy follows the Pareto principle: the priority is building modules that identify the relatively small number of common reporting errors that account for the majority of avoidable errors. In other words, we focus on the 20% of issues that, when detected, help prevent 80% of reporting errors.</w:t>
-      </w:r>
-    </w:p>
-    <w:bookmarkEnd w:id="56"/>
-    <w:bookmarkStart w:id="91" w:name="references"/>
+        <w:t xml:space="preserve">To prevent the widespread misuse of an automated tool such as Metacheck, it is important to recognize its limitations. Although it may seem desirable for every module to achieve very high accuracy, a cost-benefit analysis suggests that, at this stage, it is more valuable to develop a broad range of modules that provide useful assistance despite moderate error rates than to devote the same effort to a small number of modules that achieve near-perfect accuracy and are primarily suitable for meta-scientific research. This trade-off reflects the inherent complexity of scientific writing. The flexibility of human language, combined with the lack of standardization in how information is reported in manuscripts, means that reducing a module error rate from 50% to 20% is often substantially easier than reducing it from 20% to 5%. Consequently, our current development strategy follows the Pareto principle: the priority is building modules that identify the relatively small number of common reporting errors that account for most avoidable errors. In other words, we focus on the 20% of issues that, when detected, help prevent 80% of reporting errors.</w:t>
+      </w:r>
+    </w:p>
+    <w:bookmarkEnd w:id="45"/>
+    <w:bookmarkStart w:id="96" w:name="references"/>
     <w:p>
       <w:pPr>
         <w:pStyle w:val="Heading1"/>
@@ -4550,14 +4681,14 @@
         <w:t xml:space="preserve">References</w:t>
       </w:r>
     </w:p>
-    <w:bookmarkStart w:id="90" w:name="refs"/>
-    <w:bookmarkStart w:id="58" w:name="ref-aczel2018quantifying"/>
+    <w:bookmarkStart w:id="95" w:name="refs"/>
+    <w:bookmarkStart w:id="47" w:name="ref-aczel2018quantifying"/>
     <w:p>
       <w:pPr>
         <w:pStyle w:val="Bibliography"/>
       </w:pPr>
       <w:r>
-        <w:t xml:space="preserve">Aczel, Balazs, Bence Palfi, Aba Szollosi, Marton Kovacs, Barnabas Szaszi, Peter Szecsi, Mark Zrubka, Quentin F Gronau, Don van den Bergh, and Eric-Jan Wagenmakers. 2018.</w:t>
+        <w:t xml:space="preserve">Aczel, Balazs, Bence Palfi, Aba Szollosi, et al. 2018.</w:t>
       </w:r>
       <w:r>
         <w:t xml:space="preserve"> </w:t>
@@ -4581,7 +4712,7 @@
       <w:r>
         <w:t xml:space="preserve">1 (3): 357–66. https://doi.org/</w:t>
       </w:r>
-      <w:hyperlink r:id="rId57">
+      <w:hyperlink r:id="rId46">
         <w:r>
           <w:rPr>
             <w:rStyle w:val="Hyperlink"/>
@@ -4593,14 +4724,17 @@
         <w:t xml:space="preserve">.</w:t>
       </w:r>
     </w:p>
-    <w:bookmarkEnd w:id="58"/>
-    <w:bookmarkStart w:id="59" w:name="ref-van_potential_2024"/>
+    <w:bookmarkEnd w:id="47"/>
+    <w:bookmarkStart w:id="48" w:name="ref-van_potential_2024"/>
     <w:p>
       <w:pPr>
         <w:pStyle w:val="Bibliography"/>
       </w:pPr>
       <w:r>
-        <w:t xml:space="preserve">Akker, Olmo R van den, Marjan Bakker, Marcel ALM van Assen, Charlotte R Pennington, Leone Verweij, Mahmoud M Elsherif, Aline Claesen, et al. 2024.</w:t>
+        <w:t xml:space="preserve">Akker, Olmo R van den, Marjan Bakker, Marcel ALM van Assen, et al.</w:t>
+      </w:r>
+      <w:r>
+        <w:t xml:space="preserve"> 2024.</w:t>
       </w:r>
       <w:r>
         <w:t xml:space="preserve"> </w:t>
@@ -4622,13 +4756,50 @@
         <w:t xml:space="preserve">.</w:t>
       </w:r>
     </w:p>
-    <w:bookmarkEnd w:id="59"/>
-    <w:bookmarkStart w:id="61" w:name="ref-appelbaum_2018"/>
+    <w:bookmarkEnd w:id="48"/>
+    <w:bookmarkStart w:id="50" w:name="ref-Quarto"/>
     <w:p>
       <w:pPr>
         <w:pStyle w:val="Bibliography"/>
       </w:pPr>
       <w:r>
+        <w:t xml:space="preserve">Allaire, JJ, and Christophe Dervieux. 2025.</w:t>
+      </w:r>
+      <w:r>
+        <w:t xml:space="preserve"> </w:t>
+      </w:r>
+      <w:r>
+        <w:rPr>
+          <w:i/>
+          <w:iCs/>
+        </w:rPr>
+        <w:t xml:space="preserve">Quarto: R Interface to ’Quarto’ Markdown Publishing System</w:t>
+      </w:r>
+      <w:r>
+        <w:t xml:space="preserve">.</w:t>
+      </w:r>
+      <w:r>
+        <w:t xml:space="preserve"> </w:t>
+      </w:r>
+      <w:hyperlink r:id="rId49">
+        <w:r>
+          <w:rPr>
+            <w:rStyle w:val="Hyperlink"/>
+          </w:rPr>
+          <w:t xml:space="preserve">https://doi.org/10.32614/CRAN.package.quarto</w:t>
+        </w:r>
+      </w:hyperlink>
+      <w:r>
+        <w:t xml:space="preserve">.</w:t>
+      </w:r>
+    </w:p>
+    <w:bookmarkEnd w:id="50"/>
+    <w:bookmarkStart w:id="52" w:name="ref-appelbaum_2018"/>
+    <w:p>
+      <w:pPr>
+        <w:pStyle w:val="Bibliography"/>
+      </w:pPr>
+      <w:r>
         <w:t xml:space="preserve">Appelbaum, Mark, Harris Cooper, Rex B. Kline, Evan Mayo-Wilson, Arthur M. Nezu, and Stephen M. Rao. 2018.</w:t>
       </w:r>
       <w:r>
@@ -4656,7 +4827,7 @@
       <w:r>
         <w:t xml:space="preserve"> </w:t>
       </w:r>
-      <w:hyperlink r:id="rId60">
+      <w:hyperlink r:id="rId51">
         <w:r>
           <w:rPr>
             <w:rStyle w:val="Hyperlink"/>
@@ -4668,8 +4839,8 @@
         <w:t xml:space="preserve">.</w:t>
       </w:r>
     </w:p>
-    <w:bookmarkEnd w:id="61"/>
-    <w:bookmarkStart w:id="63" w:name="ref-bendel1977comparison"/>
+    <w:bookmarkEnd w:id="52"/>
+    <w:bookmarkStart w:id="54" w:name="ref-bendel1977comparison"/>
     <w:p>
       <w:pPr>
         <w:pStyle w:val="Bibliography"/>
@@ -4711,7 +4882,7 @@
       <w:r>
         <w:t xml:space="preserve">72 (357): 46–53. https://doi.org/</w:t>
       </w:r>
-      <w:hyperlink r:id="rId62">
+      <w:hyperlink r:id="rId53">
         <w:r>
           <w:rPr>
             <w:rStyle w:val="Hyperlink"/>
@@ -4723,8 +4894,8 @@
         <w:t xml:space="preserve">.</w:t>
       </w:r>
     </w:p>
-    <w:bookmarkEnd w:id="63"/>
-    <w:bookmarkStart w:id="65" w:name="ref-cummins_2026"/>
+    <w:bookmarkEnd w:id="54"/>
+    <w:bookmarkStart w:id="56" w:name="ref-cummins_2026"/>
     <w:p>
       <w:pPr>
         <w:pStyle w:val="Bibliography"/>
@@ -4736,12 +4907,19 @@
         <w:t xml:space="preserve"> </w:t>
       </w:r>
       <w:r>
-        <w:t xml:space="preserve">“RegCheck: A Tool for Automating Comparisons Between Study Registrations and Papers.”</w:t>
-      </w:r>
-      <w:r>
-        <w:t xml:space="preserve"> </w:t>
-      </w:r>
-      <w:hyperlink r:id="rId64">
+        <w:rPr>
+          <w:i/>
+          <w:iCs/>
+        </w:rPr>
+        <w:t xml:space="preserve">RegCheck: A Tool for Automating Comparisons Between Study Registrations and Papers</w:t>
+      </w:r>
+      <w:r>
+        <w:t xml:space="preserve">.</w:t>
+      </w:r>
+      <w:r>
+        <w:t xml:space="preserve"> </w:t>
+      </w:r>
+      <w:hyperlink r:id="rId55">
         <w:r>
           <w:rPr>
             <w:rStyle w:val="Hyperlink"/>
@@ -4753,13 +4931,50 @@
         <w:t xml:space="preserve">.</w:t>
       </w:r>
     </w:p>
-    <w:bookmarkEnd w:id="65"/>
-    <w:bookmarkStart w:id="67" w:name="ref-dexter2017narrative"/>
+    <w:bookmarkEnd w:id="56"/>
+    <w:bookmarkStart w:id="58" w:name="ref-R-metacheck"/>
     <w:p>
       <w:pPr>
         <w:pStyle w:val="Bibliography"/>
       </w:pPr>
       <w:r>
+        <w:t xml:space="preserve">DeBruine, Lisa, Cristian Mesquida, Jakub Werner, and Daniel Lakens. 2026.</w:t>
+      </w:r>
+      <w:r>
+        <w:t xml:space="preserve"> </w:t>
+      </w:r>
+      <w:r>
+        <w:rPr>
+          <w:i/>
+          <w:iCs/>
+        </w:rPr>
+        <w:t xml:space="preserve">Metacheck: Check Research Outputs for Best Practices</w:t>
+      </w:r>
+      <w:r>
+        <w:t xml:space="preserve">.</w:t>
+      </w:r>
+      <w:r>
+        <w:t xml:space="preserve"> </w:t>
+      </w:r>
+      <w:hyperlink r:id="rId57">
+        <w:r>
+          <w:rPr>
+            <w:rStyle w:val="Hyperlink"/>
+          </w:rPr>
+          <w:t xml:space="preserve">https://github.com/scienceverse/metacheck</w:t>
+        </w:r>
+      </w:hyperlink>
+      <w:r>
+        <w:t xml:space="preserve">.</w:t>
+      </w:r>
+    </w:p>
+    <w:bookmarkEnd w:id="58"/>
+    <w:bookmarkStart w:id="60" w:name="ref-dexter2017narrative"/>
+    <w:p>
+      <w:pPr>
+        <w:pStyle w:val="Bibliography"/>
+      </w:pPr>
+      <w:r>
         <w:t xml:space="preserve">Dexter, Franklin, and Steven L Shafer. 2017.</w:t>
       </w:r>
       <w:r>
@@ -4784,7 +4999,7 @@
       <w:r>
         <w:t xml:space="preserve">124 (3): 943–47. https://doi.org/</w:t>
       </w:r>
-      <w:hyperlink r:id="rId66">
+      <w:hyperlink r:id="rId59">
         <w:r>
           <w:rPr>
             <w:rStyle w:val="Hyperlink"/>
@@ -4796,8 +5011,8 @@
         <w:t xml:space="preserve">.</w:t>
       </w:r>
     </w:p>
-    <w:bookmarkEnd w:id="67"/>
-    <w:bookmarkStart w:id="69" w:name="ref-goos2024assessing"/>
+    <w:bookmarkEnd w:id="60"/>
+    <w:bookmarkStart w:id="62" w:name="ref-goos2024assessing"/>
     <w:p>
       <w:pPr>
         <w:pStyle w:val="Bibliography"/>
@@ -4809,15 +5024,16 @@
         <w:t xml:space="preserve"> </w:t>
       </w:r>
       <w:r>
-        <w:t xml:space="preserve">“Assessing Reliable and Valid Measurement as a Prerequisite for Informative Replications in Psychology.”</w:t>
-      </w:r>
-      <w:r>
-        <w:t xml:space="preserve"> </w:t>
-      </w:r>
-      <w:r>
-        <w:t xml:space="preserve">https://doi.org/</w:t>
-      </w:r>
-      <w:hyperlink r:id="rId68">
+        <w:rPr>
+          <w:i/>
+          <w:iCs/>
+        </w:rPr>
+        <w:t xml:space="preserve">Assessing Reliable and Valid Measurement as a Prerequisite for Informative Replications in Psychology</w:t>
+      </w:r>
+      <w:r>
+        <w:t xml:space="preserve">. https://doi.org/</w:t>
+      </w:r>
+      <w:hyperlink r:id="rId61">
         <w:r>
           <w:rPr>
             <w:rStyle w:val="Hyperlink"/>
@@ -4829,8 +5045,8 @@
         <w:t xml:space="preserve">.</w:t>
       </w:r>
     </w:p>
-    <w:bookmarkEnd w:id="69"/>
-    <w:bookmarkStart w:id="71" w:name="ref-hoenig_2001"/>
+    <w:bookmarkEnd w:id="62"/>
+    <w:bookmarkStart w:id="64" w:name="ref-hoenig_2001"/>
     <w:p>
       <w:pPr>
         <w:pStyle w:val="Bibliography"/>
@@ -4863,7 +5079,7 @@
       <w:r>
         <w:t xml:space="preserve"> </w:t>
       </w:r>
-      <w:hyperlink r:id="rId70">
+      <w:hyperlink r:id="rId63">
         <w:r>
           <w:rPr>
             <w:rStyle w:val="Hyperlink"/>
@@ -4875,8 +5091,8 @@
         <w:t xml:space="preserve">.</w:t>
       </w:r>
     </w:p>
-    <w:bookmarkEnd w:id="71"/>
-    <w:bookmarkStart w:id="72" w:name="ref-hosmer2013applied"/>
+    <w:bookmarkEnd w:id="64"/>
+    <w:bookmarkStart w:id="65" w:name="ref-hosmer2013applied"/>
     <w:p>
       <w:pPr>
         <w:pStyle w:val="Bibliography"/>
@@ -4898,8 +5114,8 @@
         <w:t xml:space="preserve">. John Wiley &amp; Sons.</w:t>
       </w:r>
     </w:p>
-    <w:bookmarkEnd w:id="72"/>
-    <w:bookmarkStart w:id="74" w:name="ref-lakens_justification_2022"/>
+    <w:bookmarkEnd w:id="65"/>
+    <w:bookmarkStart w:id="67" w:name="ref-lakens_justification_2022"/>
     <w:p>
       <w:pPr>
         <w:pStyle w:val="Bibliography"/>
@@ -4917,12 +5133,6 @@
         <w:t xml:space="preserve"> </w:t>
       </w:r>
       <w:r>
-        <w:t xml:space="preserve">Edited by Don van Ravenzwaaij.</w:t>
-      </w:r>
-      <w:r>
-        <w:t xml:space="preserve"> </w:t>
-      </w:r>
-      <w:r>
         <w:rPr>
           <w:i/>
           <w:iCs/>
@@ -4938,7 +5148,7 @@
       <w:r>
         <w:t xml:space="preserve"> </w:t>
       </w:r>
-      <w:hyperlink r:id="rId73">
+      <w:hyperlink r:id="rId66">
         <w:r>
           <w:rPr>
             <w:rStyle w:val="Hyperlink"/>
@@ -4950,8 +5160,8 @@
         <w:t xml:space="preserve">.</w:t>
       </w:r>
     </w:p>
-    <w:bookmarkEnd w:id="74"/>
-    <w:bookmarkStart w:id="76" w:name="ref-lakens_equivalence_2018"/>
+    <w:bookmarkEnd w:id="67"/>
+    <w:bookmarkStart w:id="69" w:name="ref-lakens_equivalence_2018"/>
     <w:p>
       <w:pPr>
         <w:pStyle w:val="Bibliography"/>
@@ -4984,7 +5194,7 @@
       <w:r>
         <w:t xml:space="preserve"> </w:t>
       </w:r>
-      <w:hyperlink r:id="rId75">
+      <w:hyperlink r:id="rId68">
         <w:r>
           <w:rPr>
             <w:rStyle w:val="Hyperlink"/>
@@ -4996,8 +5206,8 @@
         <w:t xml:space="preserve">.</w:t>
       </w:r>
     </w:p>
-    <w:bookmarkEnd w:id="76"/>
-    <w:bookmarkStart w:id="78" w:name="ref-nuijten_2016"/>
+    <w:bookmarkEnd w:id="69"/>
+    <w:bookmarkStart w:id="71" w:name="ref-nuijten_2016"/>
     <w:p>
       <w:pPr>
         <w:pStyle w:val="Bibliography"/>
@@ -5033,7 +5243,7 @@
       <w:r>
         <w:t xml:space="preserve"> </w:t>
       </w:r>
-      <w:hyperlink r:id="rId77">
+      <w:hyperlink r:id="rId70">
         <w:r>
           <w:rPr>
             <w:rStyle w:val="Hyperlink"/>
@@ -5045,14 +5255,54 @@
         <w:t xml:space="preserve">.</w:t>
       </w:r>
     </w:p>
-    <w:bookmarkEnd w:id="78"/>
-    <w:bookmarkStart w:id="79" w:name="ref-roseler_replication_2024"/>
+    <w:bookmarkEnd w:id="71"/>
+    <w:bookmarkStart w:id="73" w:name="ref-RStudio"/>
     <w:p>
       <w:pPr>
         <w:pStyle w:val="Bibliography"/>
       </w:pPr>
       <w:r>
-        <w:t xml:space="preserve">Röseler, Lukas, Leonard Kaiser, Christopher Doetsch, Noah Klett, Christian Seida, Astrid Schütz, Balazs Aczel, et al. 2024.</w:t>
+        <w:t xml:space="preserve">Posit team. 2026.</w:t>
+      </w:r>
+      <w:r>
+        <w:t xml:space="preserve"> </w:t>
+      </w:r>
+      <w:r>
+        <w:rPr>
+          <w:i/>
+          <w:iCs/>
+        </w:rPr>
+        <w:t xml:space="preserve">RStudio: Integrated Development Environment for r</w:t>
+      </w:r>
+      <w:r>
+        <w:t xml:space="preserve">. Posit Software, PBC.</w:t>
+      </w:r>
+      <w:r>
+        <w:t xml:space="preserve"> </w:t>
+      </w:r>
+      <w:hyperlink r:id="rId72">
+        <w:r>
+          <w:rPr>
+            <w:rStyle w:val="Hyperlink"/>
+          </w:rPr>
+          <w:t xml:space="preserve">http://www.posit.co/</w:t>
+        </w:r>
+      </w:hyperlink>
+      <w:r>
+        <w:t xml:space="preserve">.</w:t>
+      </w:r>
+    </w:p>
+    <w:bookmarkEnd w:id="73"/>
+    <w:bookmarkStart w:id="74" w:name="ref-roseler_replication_2024"/>
+    <w:p>
+      <w:pPr>
+        <w:pStyle w:val="Bibliography"/>
+      </w:pPr>
+      <w:r>
+        <w:t xml:space="preserve">Röseler, Lukas, Leonard Kaiser, Christopher Doetsch, et al.</w:t>
+      </w:r>
+      <w:r>
+        <w:t xml:space="preserve"> 2024.</w:t>
       </w:r>
       <w:r>
         <w:t xml:space="preserve"> </w:t>
@@ -5077,8 +5327,8 @@
         <w:t xml:space="preserve">12 (1): 8–8.</w:t>
       </w:r>
     </w:p>
-    <w:bookmarkEnd w:id="79"/>
-    <w:bookmarkStart w:id="81" w:name="ref-schimmack_2017"/>
+    <w:bookmarkEnd w:id="74"/>
+    <w:bookmarkStart w:id="76" w:name="ref-schimmack_2017"/>
     <w:p>
       <w:pPr>
         <w:pStyle w:val="Bibliography"/>
@@ -5095,7 +5345,7 @@
       <w:r>
         <w:t xml:space="preserve"> </w:t>
       </w:r>
-      <w:hyperlink r:id="rId80">
+      <w:hyperlink r:id="rId75">
         <w:r>
           <w:rPr>
             <w:rStyle w:val="Hyperlink"/>
@@ -5107,8 +5357,8 @@
         <w:t xml:space="preserve">.</w:t>
       </w:r>
     </w:p>
-    <w:bookmarkEnd w:id="81"/>
-    <w:bookmarkStart w:id="83" w:name="ref-sharpe2013resistance"/>
+    <w:bookmarkEnd w:id="76"/>
+    <w:bookmarkStart w:id="78" w:name="ref-sharpe2013resistance"/>
     <w:p>
       <w:pPr>
         <w:pStyle w:val="Bibliography"/>
@@ -5138,7 +5388,7 @@
       <w:r>
         <w:t xml:space="preserve">18 (4): 572. https://doi.org/</w:t>
       </w:r>
-      <w:hyperlink r:id="rId82">
+      <w:hyperlink r:id="rId77">
         <w:r>
           <w:rPr>
             <w:rStyle w:val="Hyperlink"/>
@@ -5150,8 +5400,8 @@
         <w:t xml:space="preserve">.</w:t>
       </w:r>
     </w:p>
-    <w:bookmarkEnd w:id="83"/>
-    <w:bookmarkStart w:id="85" w:name="ref-simonsohn2014"/>
+    <w:bookmarkEnd w:id="78"/>
+    <w:bookmarkStart w:id="80" w:name="ref-simonsohn2014"/>
     <w:p>
       <w:pPr>
         <w:pStyle w:val="Bibliography"/>
@@ -5184,7 +5434,7 @@
       <w:r>
         <w:t xml:space="preserve"> </w:t>
       </w:r>
-      <w:hyperlink r:id="rId84">
+      <w:hyperlink r:id="rId79">
         <w:r>
           <w:rPr>
             <w:rStyle w:val="Hyperlink"/>
@@ -5196,8 +5446,8 @@
         <w:t xml:space="preserve">.</w:t>
       </w:r>
     </w:p>
-    <w:bookmarkEnd w:id="85"/>
-    <w:bookmarkStart w:id="87" w:name="ref-tendeiro2024diagnosing"/>
+    <w:bookmarkEnd w:id="80"/>
+    <w:bookmarkStart w:id="82" w:name="ref-tendeiro2024diagnosing"/>
     <w:p>
       <w:pPr>
         <w:pStyle w:val="Bibliography"/>
@@ -5227,7 +5477,7 @@
       <w:r>
         <w:t xml:space="preserve">7 (1): 25152459231213371. https://doi.org/</w:t>
       </w:r>
-      <w:hyperlink r:id="rId86">
+      <w:hyperlink r:id="rId81">
         <w:r>
           <w:rPr>
             <w:rStyle w:val="Hyperlink"/>
@@ -5239,8 +5489,8 @@
         <w:t xml:space="preserve">.</w:t>
       </w:r>
     </w:p>
-    <w:bookmarkEnd w:id="87"/>
-    <w:bookmarkStart w:id="89" w:name="ref-thibault2024evaluation"/>
+    <w:bookmarkEnd w:id="82"/>
+    <w:bookmarkStart w:id="84" w:name="ref-thibault2024evaluation"/>
     <w:p>
       <w:pPr>
         <w:pStyle w:val="Bibliography"/>
@@ -5267,7 +5517,7 @@
       <w:r>
         <w:t xml:space="preserve">, 2024–07. https://doi.org/</w:t>
       </w:r>
-      <w:hyperlink r:id="rId88">
+      <w:hyperlink r:id="rId83">
         <w:r>
           <w:rPr>
             <w:rStyle w:val="Hyperlink"/>
@@ -5279,10 +5529,202 @@
         <w:t xml:space="preserve">.</w:t>
       </w:r>
     </w:p>
-    <w:bookmarkEnd w:id="89"/>
+    <w:bookmarkEnd w:id="84"/>
+    <w:bookmarkStart w:id="86" w:name="ref-R-stringr"/>
+    <w:p>
+      <w:pPr>
+        <w:pStyle w:val="Bibliography"/>
+      </w:pPr>
+      <w:r>
+        <w:t xml:space="preserve">Wickham, Hadley. 2025.</w:t>
+      </w:r>
+      <w:r>
+        <w:t xml:space="preserve"> </w:t>
+      </w:r>
+      <w:r>
+        <w:rPr>
+          <w:i/>
+          <w:iCs/>
+        </w:rPr>
+        <w:t xml:space="preserve">Stringr: Simple, Consistent Wrappers for Common String Operations</w:t>
+      </w:r>
+      <w:r>
+        <w:t xml:space="preserve">.</w:t>
+      </w:r>
+      <w:r>
+        <w:t xml:space="preserve"> </w:t>
+      </w:r>
+      <w:hyperlink r:id="rId85">
+        <w:r>
+          <w:rPr>
+            <w:rStyle w:val="Hyperlink"/>
+          </w:rPr>
+          <w:t xml:space="preserve">https://stringr.tidyverse.org</w:t>
+        </w:r>
+      </w:hyperlink>
+      <w:r>
+        <w:t xml:space="preserve">.</w:t>
+      </w:r>
+    </w:p>
+    <w:bookmarkEnd w:id="86"/>
+    <w:bookmarkStart w:id="88" w:name="ref-R-ggplot2"/>
+    <w:p>
+      <w:pPr>
+        <w:pStyle w:val="Bibliography"/>
+      </w:pPr>
+      <w:r>
+        <w:t xml:space="preserve">Wickham, Hadley, Winston Chang, Lionel Henry, et al.</w:t>
+      </w:r>
+      <w:r>
+        <w:t xml:space="preserve"> 2026.</w:t>
+      </w:r>
+      <w:r>
+        <w:t xml:space="preserve"> </w:t>
+      </w:r>
+      <w:r>
+        <w:rPr>
+          <w:i/>
+          <w:iCs/>
+        </w:rPr>
+        <w:t xml:space="preserve">Ggplot2: Create Elegant Data Visualisations Using the Grammar of Graphics</w:t>
+      </w:r>
+      <w:r>
+        <w:t xml:space="preserve">.</w:t>
+      </w:r>
+      <w:r>
+        <w:t xml:space="preserve"> </w:t>
+      </w:r>
+      <w:hyperlink r:id="rId87">
+        <w:r>
+          <w:rPr>
+            <w:rStyle w:val="Hyperlink"/>
+          </w:rPr>
+          <w:t xml:space="preserve">https://ggplot2.tidyverse.org</w:t>
+        </w:r>
+      </w:hyperlink>
+      <w:r>
+        <w:t xml:space="preserve">.</w:t>
+      </w:r>
+    </w:p>
+    <w:bookmarkEnd w:id="88"/>
+    <w:bookmarkStart w:id="90" w:name="ref-R-dplyr"/>
+    <w:p>
+      <w:pPr>
+        <w:pStyle w:val="Bibliography"/>
+      </w:pPr>
+      <w:r>
+        <w:t xml:space="preserve">Wickham, Hadley, Romain François, Lionel Henry, Kirill Müller, and Davis Vaughan. 2026.</w:t>
+      </w:r>
+      <w:r>
+        <w:t xml:space="preserve"> </w:t>
+      </w:r>
+      <w:r>
+        <w:rPr>
+          <w:i/>
+          <w:iCs/>
+        </w:rPr>
+        <w:t xml:space="preserve">Dplyr: A Grammar of Data Manipulation</w:t>
+      </w:r>
+      <w:r>
+        <w:t xml:space="preserve">.</w:t>
+      </w:r>
+      <w:r>
+        <w:t xml:space="preserve"> </w:t>
+      </w:r>
+      <w:hyperlink r:id="rId89">
+        <w:r>
+          <w:rPr>
+            <w:rStyle w:val="Hyperlink"/>
+          </w:rPr>
+          <w:t xml:space="preserve">https://dplyr.tidyverse.org</w:t>
+        </w:r>
+      </w:hyperlink>
+      <w:r>
+        <w:t xml:space="preserve">.</w:t>
+      </w:r>
+    </w:p>
     <w:bookmarkEnd w:id="90"/>
-    <w:bookmarkEnd w:id="91"/>
-    <w:sectPr/>
+    <w:bookmarkStart w:id="92" w:name="ref-R-knitr"/>
+    <w:p>
+      <w:pPr>
+        <w:pStyle w:val="Bibliography"/>
+      </w:pPr>
+      <w:r>
+        <w:t xml:space="preserve">Xie, Yihui. 2025.</w:t>
+      </w:r>
+      <w:r>
+        <w:t xml:space="preserve"> </w:t>
+      </w:r>
+      <w:r>
+        <w:rPr>
+          <w:i/>
+          <w:iCs/>
+        </w:rPr>
+        <w:t xml:space="preserve">Knitr: A General-Purpose Package for Dynamic Report Generation in r</w:t>
+      </w:r>
+      <w:r>
+        <w:t xml:space="preserve">.</w:t>
+      </w:r>
+      <w:r>
+        <w:t xml:space="preserve"> </w:t>
+      </w:r>
+      <w:hyperlink r:id="rId91">
+        <w:r>
+          <w:rPr>
+            <w:rStyle w:val="Hyperlink"/>
+          </w:rPr>
+          <w:t xml:space="preserve">https://yihui.org/knitr/</w:t>
+        </w:r>
+      </w:hyperlink>
+      <w:r>
+        <w:t xml:space="preserve">.</w:t>
+      </w:r>
+    </w:p>
+    <w:bookmarkEnd w:id="92"/>
+    <w:bookmarkStart w:id="94" w:name="ref-R-kableExtra"/>
+    <w:p>
+      <w:pPr>
+        <w:pStyle w:val="Bibliography"/>
+      </w:pPr>
+      <w:r>
+        <w:t xml:space="preserve">Zhu, Hao. 2024.</w:t>
+      </w:r>
+      <w:r>
+        <w:t xml:space="preserve"> </w:t>
+      </w:r>
+      <w:r>
+        <w:rPr>
+          <w:i/>
+          <w:iCs/>
+        </w:rPr>
+        <w:t xml:space="preserve">kableExtra: Construct Complex Table with Kable and Pipe Syntax</w:t>
+      </w:r>
+      <w:r>
+        <w:t xml:space="preserve">.</w:t>
+      </w:r>
+      <w:r>
+        <w:t xml:space="preserve"> </w:t>
+      </w:r>
+      <w:hyperlink r:id="rId93">
+        <w:r>
+          <w:rPr>
+            <w:rStyle w:val="Hyperlink"/>
+          </w:rPr>
+          <w:t xml:space="preserve">http://haozhu233.github.io/kableExtra/</w:t>
+        </w:r>
+      </w:hyperlink>
+      <w:r>
+        <w:t xml:space="preserve">.</w:t>
+      </w:r>
+    </w:p>
+    <w:bookmarkEnd w:id="94"/>
+    <w:bookmarkEnd w:id="95"/>
+    <w:bookmarkEnd w:id="96"/>
+    <w:sectPr>
+      <w:footnotePr>
+        <w:numRestart w:val="eachSect"/>
+      </w:footnotePr>
+    </w:sectPr>
   </w:body>
 </w:document>
 </file>
@@ -5399,10 +5841,10 @@
   <w:docDefaults>
     <w:rPrDefault>
       <w:rPr>
-        <w:rFonts w:asciiTheme="minorHAnsi" w:cstheme="minorBidi" w:eastAsiaTheme="minorHAnsi" w:hAnsiTheme="minorHAnsi"/>
+        <w:rFonts w:asciiTheme="minorHAnsi" w:cstheme="minorBidi" w:eastAsiaTheme="minorEastAsia" w:hAnsiTheme="minorHAnsi"/>
         <w:sz w:val="24"/>
         <w:szCs w:val="24"/>
-        <w:lang w:bidi="ar-SA" w:eastAsia="en-US" w:val="en-US"/>
+        <w:lang w:bidi="ar-SA" w:eastAsia="zh-CN" w:val="en-US"/>
       </w:rPr>
     </w:rPrDefault>
     <w:pPrDefault>
@@ -5454,8 +5896,6 @@
     </w:pPr>
     <w:rPr>
       <w:rFonts w:asciiTheme="majorHAnsi" w:cstheme="majorBidi" w:eastAsiaTheme="majorEastAsia" w:hAnsiTheme="majorHAnsi"/>
-      <w:spacing w:val="-10"/>
-      <w:kern w:val="28"/>
       <w:sz w:val="56"/>
       <w:szCs w:val="56"/>
     </w:rPr>
@@ -5468,8 +5908,6 @@
     <w:rsid w:val="00A10FD9"/>
     <w:rPr>
       <w:rFonts w:asciiTheme="majorHAnsi" w:cstheme="majorBidi" w:eastAsiaTheme="majorEastAsia" w:hAnsiTheme="majorHAnsi"/>
-      <w:spacing w:val="-10"/>
-      <w:kern w:val="28"/>
       <w:sz w:val="56"/>
       <w:szCs w:val="56"/>
     </w:rPr>
@@ -5510,23 +5948,31 @@
   </w:style>
   <w:style w:customStyle="1" w:styleId="Author" w:type="paragraph">
     <w:name w:val="Author"/>
+    <w:basedOn w:val="Title"/>
     <w:next w:val="BodyText"/>
     <w:qFormat/>
     <w:pPr>
       <w:keepNext/>
       <w:keepLines/>
-      <w:jc w:val="center"/>
     </w:pPr>
+    <w:rPr>
+      <w:sz w:val="24"/>
+      <w:szCs w:val="24"/>
+    </w:rPr>
   </w:style>
   <w:style w:styleId="Date" w:type="paragraph">
     <w:name w:val="Date"/>
+    <w:basedOn w:val="Title"/>
     <w:next w:val="BodyText"/>
     <w:qFormat/>
     <w:pPr>
       <w:keepNext/>
       <w:keepLines/>
-      <w:jc w:val="center"/>
     </w:pPr>
+    <w:rPr>
+      <w:sz w:val="24"/>
+      <w:szCs w:val="24"/>
+    </w:rPr>
   </w:style>
   <w:style w:customStyle="1" w:styleId="AbstractTitle" w:type="paragraph">
     <w:name w:val="Abstract Title"/>
@@ -5939,13 +6385,6 @@
       </w:tblCellMar>
     </w:tblPr>
     <w:tblStylePr w:type="firstRow">
-      <w:tblPr>
-        <w:jc w:val="left"/>
-        <w:tblInd w:type="dxa" w:w="0"/>
-      </w:tblPr>
-      <w:trPr>
-        <w:jc w:val="left"/>
-      </w:trPr>
       <w:tcPr>
         <w:tcBorders>
           <w:bottom w:val="single"/>

</xml_diff>